<commit_message>
docs: add all 9 submission screenshots, update README and embedded report
</commit_message>
<xml_diff>
--- a/Homework_2_Report_Ven_KemLeap.docx
+++ b/Homework_2_Report_Ven_KemLeap.docx
@@ -663,7 +663,7 @@
           <w:color w:val="1E293B"/>
           <w:sz w:val="24"/>
         </w:rPr>
-        <w:t>Active Swarm Service Verification:</w:t>
+        <w:t>Active Swarm Cluster &amp; Service Verification (AWS EC2):</w:t>
       </w:r>
     </w:p>
     <w:p>
@@ -678,18 +678,31 @@
           <w:color w:val="1E293B"/>
           <w:sz w:val="17"/>
         </w:rPr>
+        <w:t>$ sudo docker node ls</w:t>
+        <w:br/>
+        <w:t>ID                            HOSTNAME           STATUS    AVAILABILITY   MANAGER STATUS   ENGINE VERSION</w:t>
+        <w:br/>
+        <w:t>ibf8oodlkcwoui3rv7q74tytu *   ip-172-31-23-38    Ready     Active         Leader           29.9.2</w:t>
+        <w:br/>
+        <w:t>rrlwbcfbyuswb9hpp4asd1agb     ip-172-31-28-252   Ready     Active                          29.9.2</w:t>
+        <w:br/>
+        <w:br/>
+        <w:t>$ sudo docker stack services cicd-homework</w:t>
+        <w:br/>
         <w:t>ID             NAME                MODE         REPLICAS   IMAGE                            PORTS</w:t>
         <w:br/>
-        <w:t>fnjch0d9oz7j   cicd-homework_web   replicated   3/3        kemleapx20/cicd-web-app:latest   *:5000-&gt;5000/tcp</w:t>
+        <w:t>7dinbedv5wf2   cicd-homework_web   replicated   3/3        kemleapx20/cicd-web-app:latest   *:5000-&gt;5000/tcp</w:t>
         <w:br/>
         <w:br/>
-        <w:t>Tasks Running:</w:t>
+        <w:t>$ sudo docker service ps cicd-homework_web</w:t>
         <w:br/>
-        <w:t>mz89iekp2t2o   cicd-homework_web.1   Running   Node: docker-desktop</w:t>
+        <w:t>ID             NAME                  IMAGE                            NODE               DESIRED STATE   CURRENT STATE</w:t>
         <w:br/>
-        <w:t>7kznpc858v3y   cicd-homework_web.2   Running   Node: docker-desktop</w:t>
+        <w:t>m49g5se22wbq   cicd-homework_web.1   kemleapx20/cicd-web-app:latest   ip-172-31-28-252   Running         Running</w:t>
         <w:br/>
-        <w:t>mh9ndpc7q3qj   cicd-homework_web.3   Running   Node: docker-desktop</w:t>
+        <w:t>pybr2z39273b   cicd-homework_web.2   kemleapx20/cicd-web-app:latest   ip-172-31-23-38    Running         Running</w:t>
+        <w:br/>
+        <w:t>qcqpmh4wd0sa   cicd-homework_web.3   kemleapx20/cicd-web-app:latest   ip-172-31-28-252   Running         Running</w:t>
       </w:r>
     </w:p>
     <w:p>
@@ -702,7 +715,7 @@
           <w:color w:val="1E293B"/>
           <w:sz w:val="24"/>
         </w:rPr>
-        <w:t>Live Health Check &amp; Load Balancing:</w:t>
+        <w:t>Live EC2 Public Health Check &amp; Load Balancing:</w:t>
       </w:r>
     </w:p>
     <w:p>
@@ -717,9 +730,9 @@
           <w:color w:val="1E293B"/>
           <w:sz w:val="17"/>
         </w:rPr>
-        <w:t>curl http://localhost:5000/health</w:t>
+        <w:t>curl http://52.90.56.1:5000/health</w:t>
         <w:br/>
-        <w:t>{"hostname":"124d2c395f83","service":"cicd-web-app","status":"UP","version":"1.0.0"}</w:t>
+        <w:t>{"hostname":"234d23a46b2a","service":"cicd-web-app","status":"UP","timestamp":"2026-10-23T18:45:56.876321+00:00","version":"1.0.0"}</w:t>
       </w:r>
     </w:p>
     <w:p>
@@ -809,6 +822,577 @@
           <w:sz w:val="20"/>
         </w:rPr>
         <w:t>Prevented outage during service updates by configuring `update_config` with `order: start-first` and `parallelism: 1`, ensuring the new replica is healthy before stopping the previous container.</w:t>
+      </w:r>
+    </w:p>
+    <w:p>
+      <w:pPr>
+        <w:spacing w:before="280" w:after="120"/>
+      </w:pPr>
+      <w:r>
+        <w:rPr>
+          <w:b/>
+          <w:color w:val="0F172A"/>
+          <w:sz w:val="28"/>
+        </w:rPr>
+        <w:t>5. Photographic Evidence &amp; Submission Screenshots</w:t>
+      </w:r>
+    </w:p>
+    <w:p>
+      <w:pPr>
+        <w:spacing w:before="200" w:after="80"/>
+      </w:pPr>
+      <w:r>
+        <w:rPr>
+          <w:b/>
+          <w:color w:val="1E293B"/>
+          <w:sz w:val="24"/>
+        </w:rPr>
+        <w:t>01. Local Microservice Running (Port 5000)</w:t>
+      </w:r>
+    </w:p>
+    <w:p>
+      <w:r>
+        <w:drawing>
+          <wp:inline xmlns:a="http://schemas.openxmlformats.org/drawingml/2006/main" xmlns:pic="http://schemas.openxmlformats.org/drawingml/2006/picture">
+            <wp:extent cx="5486400" cy="2914650"/>
+            <wp:docPr id="1" name="Picture 1"/>
+            <wp:cNvGraphicFramePr>
+              <a:graphicFrameLocks noChangeAspect="1"/>
+            </wp:cNvGraphicFramePr>
+            <a:graphic>
+              <a:graphicData uri="http://schemas.openxmlformats.org/drawingml/2006/picture">
+                <pic:pic>
+                  <pic:nvPicPr>
+                    <pic:cNvPr id="0" name="01 - Local Application Running.jpg"/>
+                    <pic:cNvPicPr/>
+                  </pic:nvPicPr>
+                  <pic:blipFill>
+                    <a:blip r:embed="rId9"/>
+                    <a:stretch>
+                      <a:fillRect/>
+                    </a:stretch>
+                  </pic:blipFill>
+                  <pic:spPr>
+                    <a:xfrm>
+                      <a:off x="0" y="0"/>
+                      <a:ext cx="5486400" cy="2914650"/>
+                    </a:xfrm>
+                    <a:prstGeom prst="rect"/>
+                  </pic:spPr>
+                </pic:pic>
+              </a:graphicData>
+            </a:graphic>
+          </wp:inline>
+        </w:drawing>
+      </w:r>
+    </w:p>
+    <w:p>
+      <w:pPr>
+        <w:spacing w:after="240"/>
+      </w:pPr>
+      <w:r>
+        <w:rPr>
+          <w:i/>
+          <w:color w:val="64748B"/>
+          <w:sz w:val="17"/>
+        </w:rPr>
+        <w:t>Figure: Local application running in Docker container with healthy status.</w:t>
+      </w:r>
+    </w:p>
+    <w:p>
+      <w:pPr>
+        <w:spacing w:before="200" w:after="80"/>
+      </w:pPr>
+      <w:r>
+        <w:rPr>
+          <w:b/>
+          <w:color w:val="1E293B"/>
+          <w:sz w:val="24"/>
+        </w:rPr>
+        <w:t>02. GitHub Webhook Instant Delivery (Cloudflare Tunnel)</w:t>
+      </w:r>
+    </w:p>
+    <w:p>
+      <w:r>
+        <w:drawing>
+          <wp:inline xmlns:a="http://schemas.openxmlformats.org/drawingml/2006/main" xmlns:pic="http://schemas.openxmlformats.org/drawingml/2006/picture">
+            <wp:extent cx="5486400" cy="3068955"/>
+            <wp:docPr id="2" name="Picture 2"/>
+            <wp:cNvGraphicFramePr>
+              <a:graphicFrameLocks noChangeAspect="1"/>
+            </wp:cNvGraphicFramePr>
+            <a:graphic>
+              <a:graphicData uri="http://schemas.openxmlformats.org/drawingml/2006/picture">
+                <pic:pic>
+                  <pic:nvPicPr>
+                    <pic:cNvPr id="0" name="02 - GitHub Webhook Delivery.jpg"/>
+                    <pic:cNvPicPr/>
+                  </pic:nvPicPr>
+                  <pic:blipFill>
+                    <a:blip r:embed="rId10"/>
+                    <a:stretch>
+                      <a:fillRect/>
+                    </a:stretch>
+                  </pic:blipFill>
+                  <pic:spPr>
+                    <a:xfrm>
+                      <a:off x="0" y="0"/>
+                      <a:ext cx="5486400" cy="3068955"/>
+                    </a:xfrm>
+                    <a:prstGeom prst="rect"/>
+                  </pic:spPr>
+                </pic:pic>
+              </a:graphicData>
+            </a:graphic>
+          </wp:inline>
+        </w:drawing>
+      </w:r>
+    </w:p>
+    <w:p>
+      <w:pPr>
+        <w:spacing w:after="240"/>
+      </w:pPr>
+      <w:r>
+        <w:rPr>
+          <w:i/>
+          <w:color w:val="64748B"/>
+          <w:sz w:val="17"/>
+        </w:rPr>
+        <w:t>Figure: Successful HTTP 200 delivery to Jenkins webhook endpoint.</w:t>
+      </w:r>
+    </w:p>
+    <w:p>
+      <w:pPr>
+        <w:spacing w:before="200" w:after="80"/>
+      </w:pPr>
+      <w:r>
+        <w:rPr>
+          <w:b/>
+          <w:color w:val="1E293B"/>
+          <w:sz w:val="24"/>
+        </w:rPr>
+        <w:t>03. GitHub Pull Request #1 Merged into main</w:t>
+      </w:r>
+    </w:p>
+    <w:p>
+      <w:r>
+        <w:drawing>
+          <wp:inline xmlns:a="http://schemas.openxmlformats.org/drawingml/2006/main" xmlns:pic="http://schemas.openxmlformats.org/drawingml/2006/picture">
+            <wp:extent cx="5486400" cy="2948940"/>
+            <wp:docPr id="3" name="Picture 3"/>
+            <wp:cNvGraphicFramePr>
+              <a:graphicFrameLocks noChangeAspect="1"/>
+            </wp:cNvGraphicFramePr>
+            <a:graphic>
+              <a:graphicData uri="http://schemas.openxmlformats.org/drawingml/2006/picture">
+                <pic:pic>
+                  <pic:nvPicPr>
+                    <pic:cNvPr id="0" name="03 - GitHub Pull Request.jpg"/>
+                    <pic:cNvPicPr/>
+                  </pic:nvPicPr>
+                  <pic:blipFill>
+                    <a:blip r:embed="rId11"/>
+                    <a:stretch>
+                      <a:fillRect/>
+                    </a:stretch>
+                  </pic:blipFill>
+                  <pic:spPr>
+                    <a:xfrm>
+                      <a:off x="0" y="0"/>
+                      <a:ext cx="5486400" cy="2948940"/>
+                    </a:xfrm>
+                    <a:prstGeom prst="rect"/>
+                  </pic:spPr>
+                </pic:pic>
+              </a:graphicData>
+            </a:graphic>
+          </wp:inline>
+        </w:drawing>
+      </w:r>
+    </w:p>
+    <w:p>
+      <w:pPr>
+        <w:spacing w:after="240"/>
+      </w:pPr>
+      <w:r>
+        <w:rPr>
+          <w:i/>
+          <w:color w:val="64748B"/>
+          <w:sz w:val="17"/>
+        </w:rPr>
+        <w:t>Figure: Feature branch merged into main via PR trigger.</w:t>
+      </w:r>
+    </w:p>
+    <w:p>
+      <w:pPr>
+        <w:spacing w:before="200" w:after="80"/>
+      </w:pPr>
+      <w:r>
+        <w:rPr>
+          <w:b/>
+          <w:color w:val="1E293B"/>
+          <w:sz w:val="24"/>
+        </w:rPr>
+        <w:t>04. Jenkins Pipeline Automation View (Build #4)</w:t>
+      </w:r>
+    </w:p>
+    <w:p>
+      <w:r>
+        <w:drawing>
+          <wp:inline xmlns:a="http://schemas.openxmlformats.org/drawingml/2006/main" xmlns:pic="http://schemas.openxmlformats.org/drawingml/2006/picture">
+            <wp:extent cx="5486400" cy="2953226"/>
+            <wp:docPr id="4" name="Picture 4"/>
+            <wp:cNvGraphicFramePr>
+              <a:graphicFrameLocks noChangeAspect="1"/>
+            </wp:cNvGraphicFramePr>
+            <a:graphic>
+              <a:graphicData uri="http://schemas.openxmlformats.org/drawingml/2006/picture">
+                <pic:pic>
+                  <pic:nvPicPr>
+                    <pic:cNvPr id="0" name="04 - Jenkins Pipeline View.jpg"/>
+                    <pic:cNvPicPr/>
+                  </pic:nvPicPr>
+                  <pic:blipFill>
+                    <a:blip r:embed="rId12"/>
+                    <a:stretch>
+                      <a:fillRect/>
+                    </a:stretch>
+                  </pic:blipFill>
+                  <pic:spPr>
+                    <a:xfrm>
+                      <a:off x="0" y="0"/>
+                      <a:ext cx="5486400" cy="2953226"/>
+                    </a:xfrm>
+                    <a:prstGeom prst="rect"/>
+                  </pic:spPr>
+                </pic:pic>
+              </a:graphicData>
+            </a:graphic>
+          </wp:inline>
+        </w:drawing>
+      </w:r>
+    </w:p>
+    <w:p>
+      <w:pPr>
+        <w:spacing w:after="240"/>
+      </w:pPr>
+      <w:r>
+        <w:rPr>
+          <w:i/>
+          <w:color w:val="64748B"/>
+          <w:sz w:val="17"/>
+        </w:rPr>
+        <w:t>Figure: Complete 100% green multi-stage declarative CI/CD pipeline execution.</w:t>
+      </w:r>
+    </w:p>
+    <w:p>
+      <w:pPr>
+        <w:spacing w:before="200" w:after="80"/>
+      </w:pPr>
+      <w:r>
+        <w:rPr>
+          <w:b/>
+          <w:color w:val="1E293B"/>
+          <w:sz w:val="24"/>
+        </w:rPr>
+        <w:t>05. Amazon ECR Private Repository (us-east-1)</w:t>
+      </w:r>
+    </w:p>
+    <w:p>
+      <w:r>
+        <w:drawing>
+          <wp:inline xmlns:a="http://schemas.openxmlformats.org/drawingml/2006/main" xmlns:pic="http://schemas.openxmlformats.org/drawingml/2006/picture">
+            <wp:extent cx="5486400" cy="2948940"/>
+            <wp:docPr id="5" name="Picture 5"/>
+            <wp:cNvGraphicFramePr>
+              <a:graphicFrameLocks noChangeAspect="1"/>
+            </wp:cNvGraphicFramePr>
+            <a:graphic>
+              <a:graphicData uri="http://schemas.openxmlformats.org/drawingml/2006/picture">
+                <pic:pic>
+                  <pic:nvPicPr>
+                    <pic:cNvPr id="0" name="05 - Amazon ECR Repository.jpg"/>
+                    <pic:cNvPicPr/>
+                  </pic:nvPicPr>
+                  <pic:blipFill>
+                    <a:blip r:embed="rId13"/>
+                    <a:stretch>
+                      <a:fillRect/>
+                    </a:stretch>
+                  </pic:blipFill>
+                  <pic:spPr>
+                    <a:xfrm>
+                      <a:off x="0" y="0"/>
+                      <a:ext cx="5486400" cy="2948940"/>
+                    </a:xfrm>
+                    <a:prstGeom prst="rect"/>
+                  </pic:spPr>
+                </pic:pic>
+              </a:graphicData>
+            </a:graphic>
+          </wp:inline>
+        </w:drawing>
+      </w:r>
+    </w:p>
+    <w:p>
+      <w:pPr>
+        <w:spacing w:after="240"/>
+      </w:pPr>
+      <w:r>
+        <w:rPr>
+          <w:i/>
+          <w:color w:val="64748B"/>
+          <w:sz w:val="17"/>
+        </w:rPr>
+        <w:t>Figure: Private ECR repository `cicd-web-app` with `:latest` and `:1` image tags.</w:t>
+      </w:r>
+    </w:p>
+    <w:p>
+      <w:pPr>
+        <w:spacing w:before="200" w:after="80"/>
+      </w:pPr>
+      <w:r>
+        <w:rPr>
+          <w:b/>
+          <w:color w:val="1E293B"/>
+          <w:sz w:val="24"/>
+        </w:rPr>
+        <w:t>06. AWS EC2 Docker Swarm Cluster Nodes</w:t>
+      </w:r>
+    </w:p>
+    <w:p>
+      <w:r>
+        <w:drawing>
+          <wp:inline xmlns:a="http://schemas.openxmlformats.org/drawingml/2006/main" xmlns:pic="http://schemas.openxmlformats.org/drawingml/2006/picture">
+            <wp:extent cx="5486400" cy="2833211"/>
+            <wp:docPr id="6" name="Picture 6"/>
+            <wp:cNvGraphicFramePr>
+              <a:graphicFrameLocks noChangeAspect="1"/>
+            </wp:cNvGraphicFramePr>
+            <a:graphic>
+              <a:graphicData uri="http://schemas.openxmlformats.org/drawingml/2006/picture">
+                <pic:pic>
+                  <pic:nvPicPr>
+                    <pic:cNvPr id="0" name="06 - EC2 Swarm Nodes.jpg"/>
+                    <pic:cNvPicPr/>
+                  </pic:nvPicPr>
+                  <pic:blipFill>
+                    <a:blip r:embed="rId14"/>
+                    <a:stretch>
+                      <a:fillRect/>
+                    </a:stretch>
+                  </pic:blipFill>
+                  <pic:spPr>
+                    <a:xfrm>
+                      <a:off x="0" y="0"/>
+                      <a:ext cx="5486400" cy="2833211"/>
+                    </a:xfrm>
+                    <a:prstGeom prst="rect"/>
+                  </pic:spPr>
+                </pic:pic>
+              </a:graphicData>
+            </a:graphic>
+          </wp:inline>
+        </w:drawing>
+      </w:r>
+    </w:p>
+    <w:p>
+      <w:pPr>
+        <w:spacing w:after="240"/>
+      </w:pPr>
+      <w:r>
+        <w:rPr>
+          <w:i/>
+          <w:color w:val="64748B"/>
+          <w:sz w:val="17"/>
+        </w:rPr>
+        <w:t>Figure: Manager (Leader) and Worker node both in Ready and Active state.</w:t>
+      </w:r>
+    </w:p>
+    <w:p>
+      <w:pPr>
+        <w:spacing w:before="200" w:after="80"/>
+      </w:pPr>
+      <w:r>
+        <w:rPr>
+          <w:b/>
+          <w:color w:val="1E293B"/>
+          <w:sz w:val="24"/>
+        </w:rPr>
+        <w:t>07. AWS EC2 Docker Swarm Services &amp; 3 Replicas</w:t>
+      </w:r>
+    </w:p>
+    <w:p>
+      <w:r>
+        <w:drawing>
+          <wp:inline xmlns:a="http://schemas.openxmlformats.org/drawingml/2006/main" xmlns:pic="http://schemas.openxmlformats.org/drawingml/2006/picture">
+            <wp:extent cx="5486400" cy="2807494"/>
+            <wp:docPr id="7" name="Picture 7"/>
+            <wp:cNvGraphicFramePr>
+              <a:graphicFrameLocks noChangeAspect="1"/>
+            </wp:cNvGraphicFramePr>
+            <a:graphic>
+              <a:graphicData uri="http://schemas.openxmlformats.org/drawingml/2006/picture">
+                <pic:pic>
+                  <pic:nvPicPr>
+                    <pic:cNvPr id="0" name="07 - EC2 Swarm Services.jpg"/>
+                    <pic:cNvPicPr/>
+                  </pic:nvPicPr>
+                  <pic:blipFill>
+                    <a:blip r:embed="rId15"/>
+                    <a:stretch>
+                      <a:fillRect/>
+                    </a:stretch>
+                  </pic:blipFill>
+                  <pic:spPr>
+                    <a:xfrm>
+                      <a:off x="0" y="0"/>
+                      <a:ext cx="5486400" cy="2807494"/>
+                    </a:xfrm>
+                    <a:prstGeom prst="rect"/>
+                  </pic:spPr>
+                </pic:pic>
+              </a:graphicData>
+            </a:graphic>
+          </wp:inline>
+        </w:drawing>
+      </w:r>
+    </w:p>
+    <w:p>
+      <w:pPr>
+        <w:spacing w:after="240"/>
+      </w:pPr>
+      <w:r>
+        <w:rPr>
+          <w:i/>
+          <w:color w:val="64748B"/>
+          <w:sz w:val="17"/>
+        </w:rPr>
+        <w:t>Figure: 3/3 replicas distributed across Manager and Worker nodes.</w:t>
+      </w:r>
+    </w:p>
+    <w:p>
+      <w:pPr>
+        <w:spacing w:before="200" w:after="80"/>
+      </w:pPr>
+      <w:r>
+        <w:rPr>
+          <w:b/>
+          <w:color w:val="1E293B"/>
+          <w:sz w:val="24"/>
+        </w:rPr>
+        <w:t>08. Live Web Application on EC2 Public IP (52.90.56.1:5000)</w:t>
+      </w:r>
+    </w:p>
+    <w:p>
+      <w:r>
+        <w:drawing>
+          <wp:inline xmlns:a="http://schemas.openxmlformats.org/drawingml/2006/main" xmlns:pic="http://schemas.openxmlformats.org/drawingml/2006/picture">
+            <wp:extent cx="5486400" cy="2940368"/>
+            <wp:docPr id="8" name="Picture 8"/>
+            <wp:cNvGraphicFramePr>
+              <a:graphicFrameLocks noChangeAspect="1"/>
+            </wp:cNvGraphicFramePr>
+            <a:graphic>
+              <a:graphicData uri="http://schemas.openxmlformats.org/drawingml/2006/picture">
+                <pic:pic>
+                  <pic:nvPicPr>
+                    <pic:cNvPr id="0" name="08 - Live Application on EC2 Public IP.jpg"/>
+                    <pic:cNvPicPr/>
+                  </pic:nvPicPr>
+                  <pic:blipFill>
+                    <a:blip r:embed="rId16"/>
+                    <a:stretch>
+                      <a:fillRect/>
+                    </a:stretch>
+                  </pic:blipFill>
+                  <pic:spPr>
+                    <a:xfrm>
+                      <a:off x="0" y="0"/>
+                      <a:ext cx="5486400" cy="2940368"/>
+                    </a:xfrm>
+                    <a:prstGeom prst="rect"/>
+                  </pic:spPr>
+                </pic:pic>
+              </a:graphicData>
+            </a:graphic>
+          </wp:inline>
+        </w:drawing>
+      </w:r>
+    </w:p>
+    <w:p>
+      <w:pPr>
+        <w:spacing w:after="240"/>
+      </w:pPr>
+      <w:r>
+        <w:rPr>
+          <w:i/>
+          <w:color w:val="64748B"/>
+          <w:sz w:val="17"/>
+        </w:rPr>
+        <w:t>Figure: Web UI publicly accessible displaying student credentials and production status.</w:t>
+      </w:r>
+    </w:p>
+    <w:p>
+      <w:pPr>
+        <w:spacing w:before="200" w:after="80"/>
+      </w:pPr>
+      <w:r>
+        <w:rPr>
+          <w:b/>
+          <w:color w:val="1E293B"/>
+          <w:sz w:val="24"/>
+        </w:rPr>
+        <w:t>09. AWS EC2 Security Groups Inbound Rules</w:t>
+      </w:r>
+    </w:p>
+    <w:p>
+      <w:r>
+        <w:drawing>
+          <wp:inline xmlns:a="http://schemas.openxmlformats.org/drawingml/2006/main" xmlns:pic="http://schemas.openxmlformats.org/drawingml/2006/picture">
+            <wp:extent cx="5486400" cy="2931795"/>
+            <wp:docPr id="9" name="Picture 9"/>
+            <wp:cNvGraphicFramePr>
+              <a:graphicFrameLocks noChangeAspect="1"/>
+            </wp:cNvGraphicFramePr>
+            <a:graphic>
+              <a:graphicData uri="http://schemas.openxmlformats.org/drawingml/2006/picture">
+                <pic:pic>
+                  <pic:nvPicPr>
+                    <pic:cNvPr id="0" name="09 - EC2 Security Groups.jpg"/>
+                    <pic:cNvPicPr/>
+                  </pic:nvPicPr>
+                  <pic:blipFill>
+                    <a:blip r:embed="rId17"/>
+                    <a:stretch>
+                      <a:fillRect/>
+                    </a:stretch>
+                  </pic:blipFill>
+                  <pic:spPr>
+                    <a:xfrm>
+                      <a:off x="0" y="0"/>
+                      <a:ext cx="5486400" cy="2931795"/>
+                    </a:xfrm>
+                    <a:prstGeom prst="rect"/>
+                  </pic:spPr>
+                </pic:pic>
+              </a:graphicData>
+            </a:graphic>
+          </wp:inline>
+        </w:drawing>
+      </w:r>
+    </w:p>
+    <w:p>
+      <w:pPr>
+        <w:spacing w:after="240"/>
+      </w:pPr>
+      <w:r>
+        <w:rPr>
+          <w:i/>
+          <w:color w:val="64748B"/>
+          <w:sz w:val="17"/>
+        </w:rPr>
+        <w:t>Figure: Security group configuration enabling Swarm overlay routing and Web port 5000.</w:t>
       </w:r>
     </w:p>
     <w:sectPr>

</xml_diff>